<commit_message>
docs(página inicial do personal): correção caso de uso e diagrama de sequência da fase de análise, criação diagrama de sequência fase de projeto.
</commit_message>
<xml_diff>
--- a/docs/engenharia-software-2/Casos de uso/Caso de uso - Página inicial do Personal.docx
+++ b/docs/engenharia-software-2/Casos de uso/Caso de uso - Página inicial do Personal.docx
@@ -303,7 +303,14 @@
           <w:rFonts w:ascii="Courier New" w:cs="Courier New" w:eastAsia="Courier New" w:hAnsi="Courier New"/>
           <w:rtl w:val="0"/>
         </w:rPr>
-        <w:t xml:space="preserve">getAlunos</w:t>
+        <w:t xml:space="preserve">obter</w:t>
+      </w:r>
+      <w:r>
+        <w:rPr>
+          <w:rFonts w:ascii="Courier New" w:cs="Courier New" w:eastAsia="Courier New" w:hAnsi="Courier New"/>
+          <w:rtl w:val="0"/>
+        </w:rPr>
+        <w:t xml:space="preserve">Alunos</w:t>
       </w:r>
       <w:r>
         <w:rPr>
@@ -859,7 +866,14 @@
           <w:rFonts w:ascii="Courier New" w:cs="Courier New" w:eastAsia="Courier New" w:hAnsi="Courier New"/>
           <w:rtl w:val="0"/>
         </w:rPr>
-        <w:t xml:space="preserve">getAlunos</w:t>
+        <w:t xml:space="preserve">obter</w:t>
+      </w:r>
+      <w:r>
+        <w:rPr>
+          <w:rFonts w:ascii="Courier New" w:cs="Courier New" w:eastAsia="Courier New" w:hAnsi="Courier New"/>
+          <w:rtl w:val="0"/>
+        </w:rPr>
+        <w:t xml:space="preserve">Alunos</w:t>
       </w:r>
       <w:r>
         <w:rPr>

</xml_diff>